<commit_message>
fix: keep Stable Diffusion and Whisper in skills only
</commit_message>
<xml_diff>
--- a/client/public/attached_assets/Mohmed_Vaid_Resume.docx
+++ b/client/public/attached_assets/Mohmed_Vaid_Resume.docx
@@ -900,25 +900,6 @@
           <w:szCs w:val="21"/>
         </w:rPr>
         <w:t xml:space="preserve">Integrated OpenAI GPT models and other AI APIs (text, image, voice) into client products, enabling smart chat interfaces, content generation, and interactive experiences.</w:t>
-      </w:r>
-    </w:p>
-    <w:p>
-      <w:pPr>
-        <w:pStyle w:val="ListParagraph"/>
-        <w:numPr>
-          <w:ilvl w:val="0"/>
-          <w:numId w:val="2"/>
-        </w:numPr>
-        <w:spacing w:after="36" w:line="264"/>
-      </w:pPr>
-      <w:r>
-        <w:rPr>
-          <w:rFonts w:ascii="Calibri" w:cs="Calibri" w:eastAsia="Calibri" w:hAnsi="Calibri"/>
-          <w:color w:val="1A1A1A"/>
-          <w:sz w:val="21"/>
-          <w:szCs w:val="21"/>
-        </w:rPr>
-        <w:t xml:space="preserve">Prototyped AI features with Stable Diffusion (image generation) and Whisper (speech-to-text) to validate real-world use cases before full implementation.</w:t>
       </w:r>
     </w:p>
     <w:p>

</xml_diff>